<commit_message>
Host Terms and Privacy Policy in the app; trim AI/OCR; age 13+ with parental permission
Add public /terms and /privacy routes rendered from typed data in
src/legal/ by one shared LegalDocument component, plus links from the
Account page. Policy wording is also rebuilt as the Word files.

Wording changes: ages 13+ (under 18 needs a parent or guardian's
permission), and AI/OCR/receipt content is removed until those features
open to the public.

Co-Authored-By: Claude Sonnet 5.5 <noreply@anthropic.com>
</commit_message>
<xml_diff>
--- a/legal/Burrow-Privacy-Policy.docx
+++ b/legal/Burrow-Privacy-Policy.docx
@@ -118,26 +118,6 @@
       </w:r>
       <w:r>
         <w:t xml:space="preserve"> an append-only log of actions in your household (who added, used, moved or removed what, corrections, settlements, members joining or leaving, and when), shown to household members as an activity feed.</w:t>
-      </w:r>
-    </w:p>
-    <w:p>
-      <w:pPr>
-        <w:pStyle w:val="ListParagraph"/>
-        <w:numPr>
-          <w:ilvl w:val="0"/>
-          <w:numId w:val="2"/>
-        </w:numPr>
-        <w:spacing w:after="80" w:line="276"/>
-      </w:pPr>
-      <w:r>
-        <w:rPr>
-          <w:b/>
-          <w:bCs/>
-        </w:rPr>
-        <w:t xml:space="preserve">Receipt photos and recipe text (limited availability):</w:t>
-      </w:r>
-      <w:r>
-        <w:t xml:space="preserve"> if you use receipt scanning or AI recipe features, the images or text you submit, the text extracted from them, and the items parsed from them.</w:t>
       </w:r>
     </w:p>
     <w:p>
@@ -699,142 +679,6 @@
           </w:p>
         </w:tc>
       </w:tr>
-      <w:tr>
-        <w:tc>
-          <w:tcPr>
-            <w:tcW w:type="dxa" w:w="2100"/>
-            <w:tcBorders>
-              <w:top w:val="single" w:color="BFBFBF" w:sz="4"/>
-              <w:left w:val="single" w:color="BFBFBF" w:sz="4"/>
-              <w:bottom w:val="single" w:color="BFBFBF" w:sz="4"/>
-              <w:right w:val="single" w:color="BFBFBF" w:sz="4"/>
-            </w:tcBorders>
-            <w:tcMar>
-              <w:top w:type="dxa" w:w="80"/>
-              <w:left w:type="dxa" w:w="120"/>
-              <w:bottom w:type="dxa" w:w="80"/>
-              <w:right w:type="dxa" w:w="120"/>
-            </w:tcMar>
-          </w:tcPr>
-          <w:p>
-            <w:r>
-              <w:t xml:space="preserve">Google Cloud Vision</w:t>
-            </w:r>
-          </w:p>
-        </w:tc>
-        <w:tc>
-          <w:tcPr>
-            <w:tcW w:type="dxa" w:w="3600"/>
-            <w:tcBorders>
-              <w:top w:val="single" w:color="BFBFBF" w:sz="4"/>
-              <w:left w:val="single" w:color="BFBFBF" w:sz="4"/>
-              <w:bottom w:val="single" w:color="BFBFBF" w:sz="4"/>
-              <w:right w:val="single" w:color="BFBFBF" w:sz="4"/>
-            </w:tcBorders>
-            <w:tcMar>
-              <w:top w:type="dxa" w:w="80"/>
-              <w:left w:type="dxa" w:w="120"/>
-              <w:bottom w:type="dxa" w:w="80"/>
-              <w:right w:type="dxa" w:w="120"/>
-            </w:tcMar>
-          </w:tcPr>
-          <w:p>
-            <w:r>
-              <w:t xml:space="preserve">Reads the text in receipt photos (receipt scanning only, limited availability)</w:t>
-            </w:r>
-          </w:p>
-        </w:tc>
-        <w:tc>
-          <w:tcPr>
-            <w:tcW w:type="dxa" w:w="3660"/>
-            <w:tcBorders>
-              <w:top w:val="single" w:color="BFBFBF" w:sz="4"/>
-              <w:left w:val="single" w:color="BFBFBF" w:sz="4"/>
-              <w:bottom w:val="single" w:color="BFBFBF" w:sz="4"/>
-              <w:right w:val="single" w:color="BFBFBF" w:sz="4"/>
-            </w:tcBorders>
-            <w:tcMar>
-              <w:top w:type="dxa" w:w="80"/>
-              <w:left w:type="dxa" w:w="120"/>
-              <w:bottom w:type="dxa" w:w="80"/>
-              <w:right w:type="dxa" w:w="120"/>
-            </w:tcMar>
-          </w:tcPr>
-          <w:p>
-            <w:r>
-              <w:t xml:space="preserve">Receipt images you upload</w:t>
-            </w:r>
-          </w:p>
-        </w:tc>
-      </w:tr>
-      <w:tr>
-        <w:tc>
-          <w:tcPr>
-            <w:tcW w:type="dxa" w:w="2100"/>
-            <w:tcBorders>
-              <w:top w:val="single" w:color="BFBFBF" w:sz="4"/>
-              <w:left w:val="single" w:color="BFBFBF" w:sz="4"/>
-              <w:bottom w:val="single" w:color="BFBFBF" w:sz="4"/>
-              <w:right w:val="single" w:color="BFBFBF" w:sz="4"/>
-            </w:tcBorders>
-            <w:tcMar>
-              <w:top w:type="dxa" w:w="80"/>
-              <w:left w:type="dxa" w:w="120"/>
-              <w:bottom w:type="dxa" w:w="80"/>
-              <w:right w:type="dxa" w:w="120"/>
-            </w:tcMar>
-          </w:tcPr>
-          <w:p>
-            <w:r>
-              <w:t xml:space="preserve">Self-hosted AI model</w:t>
-            </w:r>
-          </w:p>
-        </w:tc>
-        <w:tc>
-          <w:tcPr>
-            <w:tcW w:type="dxa" w:w="3600"/>
-            <w:tcBorders>
-              <w:top w:val="single" w:color="BFBFBF" w:sz="4"/>
-              <w:left w:val="single" w:color="BFBFBF" w:sz="4"/>
-              <w:bottom w:val="single" w:color="BFBFBF" w:sz="4"/>
-              <w:right w:val="single" w:color="BFBFBF" w:sz="4"/>
-            </w:tcBorders>
-            <w:tcMar>
-              <w:top w:type="dxa" w:w="80"/>
-              <w:left w:type="dxa" w:w="120"/>
-              <w:bottom w:type="dxa" w:w="80"/>
-              <w:right w:type="dxa" w:w="120"/>
-            </w:tcMar>
-          </w:tcPr>
-          <w:p>
-            <w:r>
-              <w:t xml:space="preserve">Parses and generates recipes (limited availability); runs on our own infrastructure, not a third party</w:t>
-            </w:r>
-          </w:p>
-        </w:tc>
-        <w:tc>
-          <w:tcPr>
-            <w:tcW w:type="dxa" w:w="3660"/>
-            <w:tcBorders>
-              <w:top w:val="single" w:color="BFBFBF" w:sz="4"/>
-              <w:left w:val="single" w:color="BFBFBF" w:sz="4"/>
-              <w:bottom w:val="single" w:color="BFBFBF" w:sz="4"/>
-              <w:right w:val="single" w:color="BFBFBF" w:sz="4"/>
-            </w:tcBorders>
-            <w:tcMar>
-              <w:top w:type="dxa" w:w="80"/>
-              <w:left w:type="dxa" w:w="120"/>
-              <w:bottom w:type="dxa" w:w="80"/>
-              <w:right w:type="dxa" w:w="120"/>
-            </w:tcMar>
-          </w:tcPr>
-          <w:p>
-            <w:r>
-              <w:t xml:space="preserve">Recipe text and prompts you submit</w:t>
-            </w:r>
-          </w:p>
-        </w:tc>
-      </w:tr>
     </w:tbl>
     <w:p>
       <w:pPr>
@@ -1025,7 +869,7 @@
         <w:spacing w:after="140" w:line="276"/>
       </w:pPr>
       <w:r>
-        <w:t xml:space="preserve">Burrow is intended for adults aged 18 and over, and is not directed to children. We do not knowingly collect personal information from anyone under 18, and in particular not from children under 13. If you believe a child has created an account, contact us and we will remove it.</w:t>
+        <w:t xml:space="preserve">Burrow is intended for people aged 13 and over and is not directed to children under 13. We do not knowingly collect personal information from anyone under 13, and if we learn that we have, we will delete it. People under 18 may use the Service only with a parent or legal guardian's permission, as described in the Terms of Service. If you believe a child under 13 has created an account, contact us and we will remove it.</w:t>
       </w:r>
     </w:p>
     <w:p>

</xml_diff>

<commit_message>
Name Cloudflare and Render as providers in the Privacy Policy (legal version 2026-10-01.2)
Co-Authored-By: Claude Sonnet 5.5 <noreply@anthropic.com>
</commit_message>
<xml_diff>
--- a/legal/Burrow-Privacy-Policy.docx
+++ b/legal/Burrow-Privacy-Policy.docx
@@ -630,7 +630,7 @@
           </w:tcPr>
           <w:p>
             <w:r>
-              <w:t xml:space="preserve">Web hosting providers</w:t>
+              <w:t xml:space="preserve">Cloudflare</w:t>
             </w:r>
           </w:p>
         </w:tc>
@@ -652,7 +652,7 @@
           </w:tcPr>
           <w:p>
             <w:r>
-              <w:t xml:space="preserve">Serve the website and the API</w:t>
+              <w:t xml:space="preserve">Hosts the website and its domain name (DNS)</w:t>
             </w:r>
           </w:p>
         </w:tc>
@@ -674,7 +674,75 @@
           </w:tcPr>
           <w:p>
             <w:r>
-              <w:t xml:space="preserve">Technical data such as IP address and request logs</w:t>
+              <w:t xml:space="preserve">Technical data such as your IP address and request logs</w:t>
+            </w:r>
+          </w:p>
+        </w:tc>
+      </w:tr>
+      <w:tr>
+        <w:tc>
+          <w:tcPr>
+            <w:tcW w:type="dxa" w:w="2100"/>
+            <w:tcBorders>
+              <w:top w:val="single" w:color="BFBFBF" w:sz="4"/>
+              <w:left w:val="single" w:color="BFBFBF" w:sz="4"/>
+              <w:bottom w:val="single" w:color="BFBFBF" w:sz="4"/>
+              <w:right w:val="single" w:color="BFBFBF" w:sz="4"/>
+            </w:tcBorders>
+            <w:tcMar>
+              <w:top w:type="dxa" w:w="80"/>
+              <w:left w:type="dxa" w:w="120"/>
+              <w:bottom w:type="dxa" w:w="80"/>
+              <w:right w:type="dxa" w:w="120"/>
+            </w:tcMar>
+          </w:tcPr>
+          <w:p>
+            <w:r>
+              <w:t xml:space="preserve">Render</w:t>
+            </w:r>
+          </w:p>
+        </w:tc>
+        <w:tc>
+          <w:tcPr>
+            <w:tcW w:type="dxa" w:w="3600"/>
+            <w:tcBorders>
+              <w:top w:val="single" w:color="BFBFBF" w:sz="4"/>
+              <w:left w:val="single" w:color="BFBFBF" w:sz="4"/>
+              <w:bottom w:val="single" w:color="BFBFBF" w:sz="4"/>
+              <w:right w:val="single" w:color="BFBFBF" w:sz="4"/>
+            </w:tcBorders>
+            <w:tcMar>
+              <w:top w:type="dxa" w:w="80"/>
+              <w:left w:type="dxa" w:w="120"/>
+              <w:bottom w:type="dxa" w:w="80"/>
+              <w:right w:type="dxa" w:w="120"/>
+            </w:tcMar>
+          </w:tcPr>
+          <w:p>
+            <w:r>
+              <w:t xml:space="preserve">Hosts the API (the server behind the app)</w:t>
+            </w:r>
+          </w:p>
+        </w:tc>
+        <w:tc>
+          <w:tcPr>
+            <w:tcW w:type="dxa" w:w="3660"/>
+            <w:tcBorders>
+              <w:top w:val="single" w:color="BFBFBF" w:sz="4"/>
+              <w:left w:val="single" w:color="BFBFBF" w:sz="4"/>
+              <w:bottom w:val="single" w:color="BFBFBF" w:sz="4"/>
+              <w:right w:val="single" w:color="BFBFBF" w:sz="4"/>
+            </w:tcBorders>
+            <w:tcMar>
+              <w:top w:type="dxa" w:w="80"/>
+              <w:left w:type="dxa" w:w="120"/>
+              <w:bottom w:type="dxa" w:w="80"/>
+              <w:right w:type="dxa" w:w="120"/>
+            </w:tcMar>
+          </w:tcPr>
+          <w:p>
+            <w:r>
+              <w:t xml:space="preserve">Technical data such as your IP address and request logs, plus the data your app sends to and receives from the API</w:t>
             </w:r>
           </w:p>
         </w:tc>

</xml_diff>